<commit_message>
updating docs and baseline
</commit_message>
<xml_diff>
--- a/docs/tesis/Carta_Presentacion_Plan_SSTedoldi.docx
+++ b/docs/tesis/Carta_Presentacion_Plan_SSTedoldi.docx
@@ -14,19 +14,31 @@
         <w:rPr>
           <w:lang w:val="es-AR"/>
         </w:rPr>
-        <w:t>Ciudad Autónoma de Buenos Aires, 2</w:t>
+        <w:t xml:space="preserve">Ciudad Autónoma de Buenos Aires, </w:t>
       </w:r>
       <w:r>
         <w:rPr>
           <w:lang w:val="es-AR"/>
         </w:rPr>
-        <w:t>3</w:t>
+        <w:t>10</w:t>
       </w:r>
       <w:r>
         <w:rPr>
           <w:lang w:val="es-AR"/>
         </w:rPr>
-        <w:t>/09/2025</w:t>
+        <w:t>/</w:t>
+      </w:r>
+      <w:r>
+        <w:rPr>
+          <w:lang w:val="es-AR"/>
+        </w:rPr>
+        <w:t>11</w:t>
+      </w:r>
+      <w:r>
+        <w:rPr>
+          <w:lang w:val="es-AR"/>
+        </w:rPr>
+        <w:t>/2025</w:t>
       </w:r>
     </w:p>
     <w:p>
@@ -65,6 +77,9 @@
         </w:rPr>
       </w:pPr>
       <w:r>
+        <w:rPr>
+          <w:lang w:val="es-AR"/>
+        </w:rPr>
         <w:t>______________________________________</w:t>
       </w:r>
     </w:p>
@@ -117,14 +132,12 @@
         </w:rPr>
         <w:t xml:space="preserve">Por la presente, someto a su consideración el proyecto de tesis "clasificación arancelaria con </w:t>
       </w:r>
-      <w:proofErr w:type="spellStart"/>
       <w:r>
         <w:rPr>
           <w:lang w:val="es-AR"/>
         </w:rPr>
-        <w:t>nlp</w:t>
+        <w:t>procesamiento de lenguaje natural</w:t>
       </w:r>
-      <w:proofErr w:type="spellEnd"/>
       <w:r>
         <w:rPr>
           <w:lang w:val="es-AR"/>
@@ -211,6 +224,7 @@
       </w:pPr>
       <w:r>
         <w:rPr>
+          <w:noProof/>
           <w:lang w:val="es-AR"/>
         </w:rPr>
         <w:drawing>
@@ -309,12 +323,12 @@
         <w:ind w:right="440"/>
         <w:jc w:val="right"/>
         <w:rPr>
-          <w:lang w:val="en-GB"/>
+          <w:lang w:val="es-AR"/>
         </w:rPr>
       </w:pPr>
       <w:r>
         <w:rPr>
-          <w:lang w:val="en-GB"/>
+          <w:lang w:val="es-AR"/>
         </w:rPr>
         <w:t>Santiago Sebastián Tedoldi</w:t>
       </w:r>
@@ -325,26 +339,20 @@
         <w:ind w:right="440"/>
         <w:jc w:val="right"/>
         <w:rPr>
-          <w:lang w:val="en-GB"/>
+          <w:lang w:val="es-AR"/>
         </w:rPr>
       </w:pPr>
       <w:r>
         <w:rPr>
-          <w:lang w:val="en-GB"/>
+          <w:lang w:val="es-AR"/>
         </w:rPr>
         <w:t>DNI:</w:t>
       </w:r>
       <w:r>
         <w:rPr>
-          <w:lang w:val="en-GB"/>
+          <w:lang w:val="es-AR"/>
         </w:rPr>
-        <w:t xml:space="preserve"> 3638667</w:t>
-      </w:r>
-      <w:r>
-        <w:rPr>
-          <w:lang w:val="en-GB"/>
-        </w:rPr>
-        <w:t>5</w:t>
+        <w:t xml:space="preserve"> 36386675</w:t>
       </w:r>
     </w:p>
     <w:p>
@@ -404,7 +412,7 @@
       <w:pPr>
         <w:jc w:val="right"/>
         <w:rPr>
-          <w:lang w:val="es-AR"/>
+          <w:lang w:val="en-GB"/>
         </w:rPr>
       </w:pPr>
     </w:p>
@@ -1227,6 +1235,7 @@
   <w:style w:type="character" w:default="1" w:styleId="Fuentedeprrafopredeter">
     <w:name w:val="Default Paragraph Font"/>
     <w:uiPriority w:val="1"/>
+    <w:semiHidden/>
     <w:unhideWhenUsed/>
   </w:style>
   <w:style w:type="table" w:default="1" w:styleId="Tablanormal">

</xml_diff>